<commit_message>
Clientes solo de presentacion: datos y contrato desde el WSDL, reglas en el servidor
- Consola y escritorio: proxy WSEurekaReference.cs generado con SvcUtil; web y movil con dotnet-svcutil.
  Se eliminan las copias a mano del contrato (IWSEureka) y de los modelos (Empleado, Cuenta, Movimiento).
- Los clientes ya no validan reglas del banco (8 digitos, importe, cuentas distintas): solo campos vacios
  y que el importe sea numero; el resto lo valida el servidor y se muestra su mensaje.
- Movil: ChannelFactory<WSEureka> con System.ServiceModel.Http en lugar del sobre SOAP armado a mano.
- README, LEEME, diagrama de clases de clientes, ERS, manual y presentacion actualizados; manual incluye el ASMX.
</commit_message>
<xml_diff>
--- a/01. UML/01. ERS/ERS_EUREKABANK_SOAP_DOTNET_BDD_GR01.docx
+++ b/01. UML/01. ERS/ERS_EUREKABANK_SOAP_DOTNET_BDD_GR01.docx
@@ -2656,7 +2656,7 @@
         <w:spacing w:after="60" w:line="276"/>
       </w:pPr>
       <w:r>
-        <w:t xml:space="preserve">Clientes organizados en modelo, vista y controlador.</w:t>
+        <w:t xml:space="preserve">Clientes organizados en modelo, vista y controlador, sin lógica de negocio: los datos y el contrato vienen del WSDL y las reglas las valida el servidor.</w:t>
       </w:r>
     </w:p>
     <w:p>
@@ -3986,7 +3986,7 @@
                 <w:sz w:val="20"/>
                 <w:szCs w:val="20"/>
               </w:rPr>
-              <w:t xml:space="preserve">Validar formato</w:t>
+              <w:t xml:space="preserve">Validar formato en el servidor</w:t>
             </w:r>
           </w:p>
         </w:tc>
@@ -4017,7 +4017,7 @@
                 <w:sz w:val="20"/>
                 <w:szCs w:val="20"/>
               </w:rPr>
-              <w:t xml:space="preserve">Cuenta de 8 dígitos; importe mayor que cero, con máximo 2 decimales y hasta 1 000 000. Los clientes lo validan antes de llamar al servidor y el servidor lo vuelve a validar (VALOR_INVALIDO).</w:t>
+              <w:t xml:space="preserve">Cuenta de 8 dígitos; importe mayor que cero, con máximo 2 decimales y hasta 1 000 000. Lo valida solo el servidor (VALOR_INVALIDO); los clientes únicamente comprueban que los campos no estén vacíos y que el importe sea un número.</w:t>
             </w:r>
           </w:p>
         </w:tc>
@@ -4915,7 +4915,7 @@
                 <w:sz w:val="20"/>
                 <w:szCs w:val="20"/>
               </w:rPr>
-              <w:t xml:space="preserve">SOAP 1.1 sobre HTTP (basicHttpBinding) con namespace http://espe.edu.ec/eureka/, consumible desde .NET Framework (ChannelFactory), .NET 8 (System.ServiceModel) y Android (sobre XML con HttpClient).</w:t>
+              <w:t xml:space="preserve">SOAP 1.1 sobre HTTP (basicHttpBinding) con namespace http://espe.edu.ec/eureka/. Los clientes generan su contrato y sus clases desde el WSDL: SvcUtil en .NET Framework y dotnet-svcutil en .NET 8 y Android. El servidor publica además las mismas operaciones como servicio ASMX (WSEureka.asmx).</w:t>
             </w:r>
           </w:p>
         </w:tc>

</xml_diff>

<commit_message>
Clientes como el GR05: modelos get/set, controlador que solo pasa llamadas, intentos de login en el servidor, clave monster69 e imagen monster
</commit_message>
<xml_diff>
--- a/01. UML/01. ERS/ERS_EUREKABANK_SOAP_DOTNET_BDD_GR01.docx
+++ b/01. UML/01. ERS/ERS_EUREKABANK_SOAP_DOTNET_BDD_GR01.docx
@@ -2549,7 +2549,7 @@
         <w:jc w:val="both"/>
       </w:pPr>
       <w:r>
-        <w:t xml:space="preserve">Un único tipo de usuario: el empleado del banco que atiende en ventanilla. Conoce las operaciones bancarias básicas; no necesita conocimientos técnicos. Para las pruebas se usa el empleado monster / monster (código 0012).</w:t>
+        <w:t xml:space="preserve">Un único tipo de usuario: el empleado del banco que atiende en ventanilla. Conoce las operaciones bancarias básicas; no necesita conocimientos técnicos. Para las pruebas se usa el empleado monster / monster69 (código 0012).</w:t>
       </w:r>
     </w:p>
     <w:p>
@@ -2656,7 +2656,7 @@
         <w:spacing w:after="60" w:line="276"/>
       </w:pPr>
       <w:r>
-        <w:t xml:space="preserve">Clientes organizados en modelo, vista y controlador, sin lógica de negocio: los datos y el contrato vienen del WSDL y las reglas las valida el servidor.</w:t>
+        <w:t xml:space="preserve">Clientes organizados en modelo, vista y controlador, sin lógica de negocio: el modelo solo tiene get/set, el controlador solo pasa las llamadas y todas las reglas (incluidos los intentos de login) las valida el servidor.</w:t>
       </w:r>
     </w:p>
     <w:p>
@@ -2993,7 +2993,7 @@
                 <w:sz w:val="20"/>
                 <w:szCs w:val="20"/>
               </w:rPr>
-              <w:t xml:space="preserve">El sistema debe validar usuario y clave contra la tabla Empleado de la base EUREKABANK mediante la operación SOAP login. Si son correctos devuelve el empleado (código, usuario y nombre); si no, devuelve null.</w:t>
+              <w:t xml:space="preserve">El sistema debe validar usuario y clave contra la tabla Empleado de la base EUREKABANK mediante la operación SOAP login. Si son correctos devuelve el empleado (código, usuario y nombre); si no, responde con un SOAP Fault que indica los intentos restantes.</w:t>
             </w:r>
           </w:p>
         </w:tc>
@@ -3122,7 +3122,7 @@
                 <w:sz w:val="20"/>
                 <w:szCs w:val="20"/>
               </w:rPr>
-              <w:t xml:space="preserve">Después de 3 intentos fallidos el cliente debe bloquear el ingreso e informar al usuario. Un error de conexión no cuenta como intento.</w:t>
+              <w:t xml:space="preserve">El servidor cuenta los intentos fallidos por usuario: informa los intentos restantes y, al tercero, bloquea al usuario 2 minutos. Los clientes solo muestran el mensaje. Un error de conexión no cuenta como intento.</w:t>
             </w:r>
           </w:p>
         </w:tc>
@@ -4915,7 +4915,7 @@
                 <w:sz w:val="20"/>
                 <w:szCs w:val="20"/>
               </w:rPr>
-              <w:t xml:space="preserve">SOAP 1.1 sobre HTTP (basicHttpBinding) con namespace http://espe.edu.ec/eureka/. Los clientes generan su contrato y sus clases desde el WSDL: SvcUtil en .NET Framework y dotnet-svcutil en .NET 8 y Android. El servidor publica además las mismas operaciones como servicio ASMX (WSEureka.asmx).</w:t>
+              <w:t xml:space="preserve">SOAP 1.1 sobre HTTP (basicHttpBinding) con namespace http://espe.edu.ec/eureka/. Los clientes declaran el contrato IWSEureka y modelos con solo get/set (Empleado, Cuenta, Movimiento, ErrorServicio) con el mismo namespace; el móvil arma el sobre SOAP con HttpClient. El servidor publica además las mismas operaciones como servicio ASMX (WSEureka.asmx).</w:t>
             </w:r>
           </w:p>
         </w:tc>
@@ -6346,7 +6346,7 @@
                 <w:sz w:val="20"/>
                 <w:szCs w:val="20"/>
               </w:rPr>
-              <w:t xml:space="preserve">Empleado { Codigo, Usuario, Nombre } o nil</w:t>
+              <w:t xml:space="preserve">Empleado { Codigo, Usuario, Nombre } o SOAP Fault (intentos restantes o bloqueo)</w:t>
             </w:r>
           </w:p>
         </w:tc>

</xml_diff>